<commit_message>
Update documentation title and asset location for DB safety guide
Update the title for the DB safety documentation in agent_assets_metadata.toml and move the associated .docx file to the attached_assets directory.

Replit-Commit-Author: Agent
Replit-Commit-Session-Id: 313d3c57-b603-45f4-9c89-fd3ad5cd46a8
Replit-Commit-Checkpoint-Type: full_checkpoint
Replit-Commit-Event-Id: f8fecd6e-c19d-4956-be34-ad0a312702ad
Replit-Commit-Screenshot-Url: https://storage.googleapis.com/screenshot-production-us-central1/bde50763-6559-4333-ab31-fe82789c512b/313d3c57-b603-45f4-9c89-fd3ad5cd46a8/wmPQCFX
Replit-Helium-Checkpoint-Created: true
</commit_message>
<xml_diff>
--- a/docs/db_safety.docx
+++ b/docs/db_safety.docx
@@ -4,21 +4,40 @@
   <w:body>
     <w:p>
       <w:pPr>
-        <w:pStyle w:val="Title"/>
+        <w:jc w:val="center"/>
       </w:pPr>
       <w:r>
         <w:rPr>
           <w:b/>
+          <w:sz w:val="28"/>
         </w:rPr>
-        <w:t>DB Safety</w:t>
+        <w:t>CLEAR SEEING APP</w:t>
       </w:r>
     </w:p>
     <w:p>
+      <w:pPr>
+        <w:pStyle w:val="Title"/>
+        <w:jc w:val="center"/>
+      </w:pPr>
+      <w:r>
+        <w:t>DB Safety Guide</w:t>
+      </w:r>
+    </w:p>
+    <w:p>
+      <w:pPr>
+        <w:jc w:val="center"/>
+      </w:pPr>
       <w:r>
         <w:rPr>
           <w:i/>
         </w:rPr>
-        <w:t>This is the simple, no-bullshit workflow to avoid breaking production.</w:t>
+        <w:t>Version 1 — March 2026</w:t>
+      </w:r>
+    </w:p>
+    <w:p/>
+    <w:p>
+      <w:r>
+        <w:t>This is the simple, no-bullshit workflow to avoid breaking production. Read it before touching anything database-related.</w:t>
       </w:r>
     </w:p>
     <w:p/>
@@ -35,13 +54,7 @@
         <w:pStyle w:val="ListBullet"/>
       </w:pPr>
       <w:r>
-        <w:rPr>
-          <w:b/>
-        </w:rPr>
-        <w:t>Prod DB (Neon)</w:t>
-      </w:r>
-      <w:r>
-        <w:t xml:space="preserve"> → source of truth</w:t>
+        <w:t>Prod DB (Neon) — source of truth. All real sessions, billing, users.</w:t>
       </w:r>
     </w:p>
     <w:p>
@@ -49,13 +62,7 @@
         <w:pStyle w:val="ListBullet"/>
       </w:pPr>
       <w:r>
-        <w:rPr>
-          <w:b/>
-        </w:rPr>
-        <w:t>Neon Branch</w:t>
-      </w:r>
-      <w:r>
-        <w:t xml:space="preserve"> → temporary safe copy</w:t>
+        <w:t>Neon Branch — temporary safe copy. Exact snapshot of prod at a moment in time.</w:t>
       </w:r>
     </w:p>
     <w:p>
@@ -63,13 +70,24 @@
         <w:pStyle w:val="ListBullet"/>
       </w:pPr>
       <w:r>
+        <w:t>Code Branch — your feature work in Git.</w:t>
+      </w:r>
+    </w:p>
+    <w:p>
+      <w:pPr>
+        <w:pStyle w:val="ListBullet"/>
+      </w:pPr>
+      <w:r>
+        <w:t>Workspace DATABASE_URL — must point to Neon prod. Not helium.</w:t>
+      </w:r>
+    </w:p>
+    <w:p/>
+    <w:p>
+      <w:r>
         <w:rPr>
           <w:b/>
         </w:rPr>
-        <w:t>Code Branch</w:t>
-      </w:r>
-      <w:r>
-        <w:t xml:space="preserve"> → your feature work</w:t>
+        <w:t>⚠ IMPORTANT: Workspace and deployment must both point to the same Neon DB. If they differ, you are debugging a database your users never see.</w:t>
       </w:r>
     </w:p>
     <w:p/>
@@ -78,7 +96,7 @@
         <w:pStyle w:val="Heading1"/>
       </w:pPr>
       <w:r>
-        <w:t>WORKFLOW</w:t>
+        <w:t>THE WORKFLOW — DO THIS EVERY TIME</w:t>
       </w:r>
     </w:p>
     <w:p>
@@ -86,33 +104,31 @@
         <w:pStyle w:val="Heading2"/>
       </w:pPr>
       <w:r>
-        <w:t>1. CREATE BRANCH (BEFORE ANY CHANGES)</w:t>
+        <w:t>Step 1 — Create Neon Branch (before any changes)</w:t>
       </w:r>
     </w:p>
     <w:p>
       <w:r>
-        <w:t>In Neon:</w:t>
+        <w:t>In Neon dashboard: Branches → Create branch. Name it:</w:t>
       </w:r>
     </w:p>
+    <w:p/>
     <w:p>
+      <w:pPr>
+        <w:ind w:left="432"/>
+      </w:pPr>
       <w:r>
-        <w:t>• Go to Branches</w:t>
-      </w:r>
-    </w:p>
-    <w:p>
-      <w:r>
-        <w:t>• Click Create branch</w:t>
-      </w:r>
-    </w:p>
-    <w:p>
-      <w:r>
-        <w:t>• Name it: feature-xyz-YYYY-MM-DD</w:t>
+        <w:rPr>
+          <w:rFonts w:ascii="Courier New" w:hAnsi="Courier New"/>
+          <w:sz w:val="20"/>
+        </w:rPr>
+        <w:t>feature-xyz-YYYY-MM-DD</w:t>
       </w:r>
     </w:p>
     <w:p/>
     <w:p>
       <w:r>
-        <w:t>This is an exact copy of production at that moment.</w:t>
+        <w:t>This is an exact copy of production at that moment. Production is untouched.</w:t>
       </w:r>
     </w:p>
     <w:p>
@@ -120,28 +136,12 @@
         <w:pStyle w:val="Heading2"/>
       </w:pPr>
       <w:r>
-        <w:t>2. POINT YOUR APP TO THE BRANCH</w:t>
+        <w:t>Step 2 — Point Workspace to Branch</w:t>
       </w:r>
     </w:p>
     <w:p>
       <w:r>
-        <w:t>Update your environment variable:</w:t>
-      </w:r>
-    </w:p>
-    <w:p/>
-    <w:p>
-      <w:r>
-        <w:rPr>
-          <w:rFonts w:ascii="Courier New" w:hAnsi="Courier New"/>
-          <w:sz w:val="20"/>
-        </w:rPr>
-        <w:t>DATABASE_URL = &lt;branch connection string&gt;</w:t>
-      </w:r>
-    </w:p>
-    <w:p/>
-    <w:p>
-      <w:r>
-        <w:t>Now your app is using the branch, NOT production.</w:t>
+        <w:t>Update workspace DATABASE_URL to the branch connection string. Now your app is using the branch, NOT production.</w:t>
       </w:r>
     </w:p>
     <w:p>
@@ -149,27 +149,39 @@
         <w:pStyle w:val="Heading2"/>
       </w:pPr>
       <w:r>
-        <w:t>3. DO YOUR WORK</w:t>
+        <w:t>Step 3 — Do Your Work</w:t>
       </w:r>
     </w:p>
     <w:p>
+      <w:pPr>
+        <w:pStyle w:val="ListBullet"/>
+      </w:pPr>
       <w:r>
-        <w:t>• Run the app</w:t>
+        <w:t>Run the app</w:t>
       </w:r>
     </w:p>
     <w:p>
+      <w:pPr>
+        <w:pStyle w:val="ListBullet"/>
+      </w:pPr>
       <w:r>
-        <w:t>• Test flows</w:t>
+        <w:t>Test flows</w:t>
       </w:r>
     </w:p>
     <w:p>
+      <w:pPr>
+        <w:pStyle w:val="ListBullet"/>
+      </w:pPr>
       <w:r>
-        <w:t>• Make schema changes if needed</w:t>
+        <w:t>Make schema changes if needed</w:t>
       </w:r>
     </w:p>
     <w:p>
+      <w:pPr>
+        <w:pStyle w:val="ListBullet"/>
+      </w:pPr>
       <w:r>
-        <w:t>• Break things safely</w:t>
+        <w:t>Break things safely</w:t>
       </w:r>
     </w:p>
     <w:p/>
@@ -183,39 +195,37 @@
         <w:pStyle w:val="Heading2"/>
       </w:pPr>
       <w:r>
-        <w:t>4. VERIFY BEFORE MERGE</w:t>
+        <w:t>Step 4 — Verify Before Deploy</w:t>
       </w:r>
     </w:p>
     <w:p>
+      <w:pPr>
+        <w:pStyle w:val="ListBullet"/>
+      </w:pPr>
       <w:r>
-        <w:t>Before deploying, confirm:</w:t>
+        <w:t>End-to-end flows work</w:t>
       </w:r>
     </w:p>
     <w:p>
+      <w:pPr>
+        <w:pStyle w:val="ListBullet"/>
+      </w:pPr>
       <w:r>
-        <w:t>• End-to-end flows work</w:t>
+        <w:t>Billing works if touched</w:t>
       </w:r>
     </w:p>
     <w:p>
+      <w:pPr>
+        <w:pStyle w:val="ListBullet"/>
+      </w:pPr>
       <w:r>
-        <w:t>• Billing works (if touched)</w:t>
-      </w:r>
-    </w:p>
-    <w:p>
-      <w:r>
-        <w:t>• Session flow works</w:t>
+        <w:t>Session flow works</w:t>
       </w:r>
     </w:p>
     <w:p/>
     <w:p>
       <w:r>
-        <w:t>Ask yourself: Would I be comfortable running this on production right now?</w:t>
-      </w:r>
-    </w:p>
-    <w:p/>
-    <w:p>
-      <w:r>
-        <w:t>If not, keep working.</w:t>
+        <w:t>Ask yourself: would I be comfortable running this on production right now? If not, keep working.</w:t>
       </w:r>
     </w:p>
     <w:p>
@@ -223,16 +233,22 @@
         <w:pStyle w:val="Heading2"/>
       </w:pPr>
       <w:r>
-        <w:t>5. SWITCH BACK TO PROD DB</w:t>
+        <w:t>Step 5 — Switch Back to Prod DB</w:t>
       </w:r>
     </w:p>
     <w:p>
       <w:r>
-        <w:t>Before deploying:</w:t>
+        <w:rPr>
+          <w:b/>
+        </w:rPr>
+        <w:t>⚠ This is the most common mistake. Do not skip this step.</w:t>
       </w:r>
     </w:p>
     <w:p/>
     <w:p>
+      <w:pPr>
+        <w:ind w:left="432"/>
+      </w:pPr>
       <w:r>
         <w:rPr>
           <w:rFonts w:ascii="Courier New" w:hAnsi="Courier New"/>
@@ -246,28 +262,12 @@
         <w:pStyle w:val="Heading2"/>
       </w:pPr>
       <w:r>
-        <w:t>6. DEPLOY CODE</w:t>
+        <w:t>Step 6 — Deploy Code</w:t>
       </w:r>
     </w:p>
     <w:p>
       <w:r>
-        <w:t>Deploy your code normally.</w:t>
-      </w:r>
-    </w:p>
-    <w:p/>
-    <w:p>
-      <w:r>
-        <w:t>IMPORTANT:</w:t>
-      </w:r>
-    </w:p>
-    <w:p>
-      <w:r>
-        <w:t>• You are deploying code only</w:t>
-      </w:r>
-    </w:p>
-    <w:p>
-      <w:r>
-        <w:t>• NOT copying data from the branch</w:t>
+        <w:t>Deploy code normally. You are deploying CODE ONLY. Not copying data from the branch.</w:t>
       </w:r>
     </w:p>
     <w:p>
@@ -275,22 +275,12 @@
         <w:pStyle w:val="Heading2"/>
       </w:pPr>
       <w:r>
-        <w:t>7. APPLY DB CHANGES (IF ANY)</w:t>
+        <w:t>Step 7 — Apply Schema Changes (if any)</w:t>
       </w:r>
     </w:p>
     <w:p>
       <w:r>
-        <w:t>If you made schema changes:</w:t>
-      </w:r>
-    </w:p>
-    <w:p>
-      <w:r>
-        <w:t>• Run migrations on production DB</w:t>
-      </w:r>
-    </w:p>
-    <w:p>
-      <w:r>
-        <w:t>• Do NOT copy data from branch</w:t>
+        <w:t>If you made schema changes, run migrations on the production DB. Do NOT copy data from branch.</w:t>
       </w:r>
     </w:p>
     <w:p>
@@ -298,12 +288,12 @@
         <w:pStyle w:val="Heading2"/>
       </w:pPr>
       <w:r>
-        <w:t>8. DELETE BRANCH</w:t>
+        <w:t>Step 8 — Delete Branch</w:t>
       </w:r>
     </w:p>
     <w:p>
       <w:r>
-        <w:t>After successful deploy, delete the Neon branch.</w:t>
+        <w:t>After successful deploy, delete the Neon branch. Done.</w:t>
       </w:r>
     </w:p>
     <w:p/>
@@ -312,58 +302,7 @@
         <w:pStyle w:val="Heading1"/>
       </w:pPr>
       <w:r>
-        <w:t>RULES (DO NOT BREAK THESE)</w:t>
-      </w:r>
-    </w:p>
-    <w:p>
-      <w:pPr>
-        <w:pStyle w:val="ListNumber"/>
-      </w:pPr>
-      <w:r>
-        <w:rPr>
-          <w:b/>
-        </w:rPr>
-        <w:t>NEVER COPY DATA FROM BRANCH TO PROD</w:t>
-      </w:r>
-      <w:r>
-        <w:t xml:space="preserve"> — Only schema moves forward.</w:t>
-      </w:r>
-    </w:p>
-    <w:p>
-      <w:pPr>
-        <w:pStyle w:val="ListNumber"/>
-      </w:pPr>
-      <w:r>
-        <w:rPr>
-          <w:b/>
-        </w:rPr>
-        <w:t>ALWAYS SWITCH DATABASE_URL BEFORE DEPLOY</w:t>
-      </w:r>
-      <w:r>
-        <w:t xml:space="preserve"> — This is the most common mistake.</w:t>
-      </w:r>
-    </w:p>
-    <w:p>
-      <w:pPr>
-        <w:pStyle w:val="ListNumber"/>
-      </w:pPr>
-      <w:r>
-        <w:rPr>
-          <w:b/>
-        </w:rPr>
-        <w:t>NEVER TEST RISKY CHANGES ON PROD</w:t>
-      </w:r>
-      <w:r>
-        <w:t xml:space="preserve"> — Always use a branch.</w:t>
-      </w:r>
-    </w:p>
-    <w:p/>
-    <w:p>
-      <w:pPr>
-        <w:pStyle w:val="Heading1"/>
-      </w:pPr>
-      <w:r>
-        <w:t>FAST VERSION</w:t>
+        <w:t>FAST VERSION — MEMORIZE THIS</w:t>
       </w:r>
     </w:p>
     <w:p>
@@ -380,6 +319,54 @@
         <w:pStyle w:val="Heading1"/>
       </w:pPr>
       <w:r>
+        <w:t>RULES — DO NOT BREAK THESE</w:t>
+      </w:r>
+    </w:p>
+    <w:p>
+      <w:pPr>
+        <w:pStyle w:val="ListNumber"/>
+      </w:pPr>
+      <w:r>
+        <w:rPr>
+          <w:b/>
+        </w:rPr>
+        <w:t>NEVER copy data from branch to prod.</w:t>
+      </w:r>
+      <w:r>
+        <w:t xml:space="preserve"> Only schema moves forward.</w:t>
+      </w:r>
+    </w:p>
+    <w:p>
+      <w:pPr>
+        <w:pStyle w:val="ListNumber"/>
+      </w:pPr>
+      <w:r>
+        <w:rPr>
+          <w:b/>
+        </w:rPr>
+        <w:t>ALWAYS switch DATABASE_URL back to prod before deploy.</w:t>
+      </w:r>
+    </w:p>
+    <w:p>
+      <w:pPr>
+        <w:pStyle w:val="ListNumber"/>
+      </w:pPr>
+      <w:r>
+        <w:rPr>
+          <w:b/>
+        </w:rPr>
+        <w:t>NEVER test risky changes directly on prod.</w:t>
+      </w:r>
+      <w:r>
+        <w:t xml:space="preserve"> Always branch first.</w:t>
+      </w:r>
+    </w:p>
+    <w:p/>
+    <w:p>
+      <w:pPr>
+        <w:pStyle w:val="Heading1"/>
+      </w:pPr>
+      <w:r>
         <w:t>COMMON MISTAKES</w:t>
       </w:r>
     </w:p>
@@ -388,7 +375,7 @@
         <w:pStyle w:val="ListBullet"/>
       </w:pPr>
       <w:r>
-        <w:t>Forgetting to switch back to prod DB</w:t>
+        <w:t>Forgetting to switch DATABASE_URL back to prod before deploying</w:t>
       </w:r>
     </w:p>
     <w:p>
@@ -396,7 +383,7 @@
         <w:pStyle w:val="ListBullet"/>
       </w:pPr>
       <w:r>
-        <w:t>Running migrations on the wrong DB</w:t>
+        <w:t>Running migrations on the wrong database</w:t>
       </w:r>
     </w:p>
     <w:p>
@@ -404,7 +391,53 @@
         <w:pStyle w:val="ListBullet"/>
       </w:pPr>
       <w:r>
-        <w:t>Treating branch as something to merge data from</w:t>
+        <w:t>Treating branch data as something to merge back</w:t>
+      </w:r>
+    </w:p>
+    <w:p>
+      <w:pPr>
+        <w:pStyle w:val="ListBullet"/>
+      </w:pPr>
+      <w:r>
+        <w:t>Trusting workspace shell queries when DATABASE_URL points to wrong DB</w:t>
+      </w:r>
+    </w:p>
+    <w:p/>
+    <w:p>
+      <w:pPr>
+        <w:pStyle w:val="Heading1"/>
+      </w:pPr>
+      <w:r>
+        <w:t>HOW WE LEARNED THIS — MARCH 2026</w:t>
+      </w:r>
+    </w:p>
+    <w:p>
+      <w:r>
+        <w:t>For weeks the workspace DATABASE_URL pointed to helium (Replit internal dev DB). The deployed app pointed to Neon. They were two completely different databases.</w:t>
+      </w:r>
+    </w:p>
+    <w:p/>
+    <w:p>
+      <w:r>
+        <w:t>Result: every workspace shell query showed an empty dev database. All verification of billing, sessions, token counts, and capacity deduction was against data that users never saw. The agent repeatedly gave false confidence because it was reading the wrong DB.</w:t>
+      </w:r>
+    </w:p>
+    <w:p/>
+    <w:p>
+      <w:r>
+        <w:t>Fix: workspace DATABASE_URL now points to Neon. One DB. One truth.</w:t>
+      </w:r>
+    </w:p>
+    <w:p/>
+    <w:p>
+      <w:r>
+        <w:rPr>
+          <w:b/>
+        </w:rPr>
+        <w:t xml:space="preserve">Lesson: </w:t>
+      </w:r>
+      <w:r>
+        <w:t>always confirm workspace and deployment point to the same database before trusting any query result.</w:t>
       </w:r>
     </w:p>
     <w:p/>
@@ -418,12 +451,7 @@
     </w:p>
     <w:p>
       <w:r>
-        <w:t>Branch = safe testing. Prod = real data.</w:t>
-      </w:r>
-    </w:p>
-    <w:p>
-      <w:r>
-        <w:t>You move code forward. You do NOT move data backward.</w:t>
+        <w:t>Branch = safe testing. Prod = real data. You move CODE forward. You do NOT move data backward.</w:t>
       </w:r>
     </w:p>
     <w:p/>
@@ -440,7 +468,7 @@
     </w:p>
     <w:sectPr>
       <w:pgSz w:w="12240" w:h="15840"/>
-      <w:pgMar w:top="1440" w:right="1800" w:bottom="1440" w:left="1800" w:header="720" w:footer="720" w:gutter="0"/>
+      <w:pgMar w:top="1440" w:right="1728" w:bottom="1440" w:left="1728" w:header="720" w:footer="720" w:gutter="0"/>
       <w:cols w:space="720"/>
       <w:docGrid w:linePitch="360"/>
     </w:sectPr>

</xml_diff>

<commit_message>
Recreate safety document to fix corruption issues
Regenerate docs/db_safety.docx to resolve corruption errors preventing file access.

Replit-Commit-Author: Agent
Replit-Commit-Session-Id: 313d3c57-b603-45f4-9c89-fd3ad5cd46a8
Replit-Commit-Checkpoint-Type: full_checkpoint
Replit-Commit-Event-Id: 39e5bcc4-e335-4b08-bf8a-0e681ae182d0
Replit-Commit-Screenshot-Url: https://storage.googleapis.com/screenshot-production-us-central1/bde50763-6559-4333-ab31-fe82789c512b/313d3c57-b603-45f4-9c89-fd3ad5cd46a8/wmPQCFX
Replit-Helium-Checkpoint-Created: true
</commit_message>
<xml_diff>
--- a/docs/db_safety.docx
+++ b/docs/db_safety.docx
@@ -9,7 +9,7 @@
       <w:r>
         <w:rPr>
           <w:b/>
-          <w:sz w:val="28"/>
+          <w:sz w:val="26"/>
         </w:rPr>
         <w:t>CLEAR SEEING APP</w:t>
       </w:r>
@@ -112,10 +112,9 @@
         <w:t>In Neon dashboard: Branches → Create branch. Name it:</w:t>
       </w:r>
     </w:p>
-    <w:p/>
     <w:p>
       <w:pPr>
-        <w:ind w:left="432"/>
+        <w:ind w:left="576"/>
       </w:pPr>
       <w:r>
         <w:rPr>
@@ -125,7 +124,6 @@
         <w:t>feature-xyz-YYYY-MM-DD</w:t>
       </w:r>
     </w:p>
-    <w:p/>
     <w:p>
       <w:r>
         <w:t>This is an exact copy of production at that moment. Production is untouched.</w:t>
@@ -184,7 +182,6 @@
         <w:t>Break things safely</w:t>
       </w:r>
     </w:p>
-    <w:p/>
     <w:p>
       <w:r>
         <w:t>Production is untouched.</w:t>
@@ -222,7 +219,6 @@
         <w:t>Session flow works</w:t>
       </w:r>
     </w:p>
-    <w:p/>
     <w:p>
       <w:r>
         <w:t>Ask yourself: would I be comfortable running this on production right now? If not, keep working.</w:t>
@@ -244,10 +240,9 @@
         <w:t>⚠ This is the most common mistake. Do not skip this step.</w:t>
       </w:r>
     </w:p>
-    <w:p/>
     <w:p>
       <w:pPr>
-        <w:ind w:left="432"/>
+        <w:ind w:left="576"/>
       </w:pPr>
       <w:r>
         <w:rPr>

</xml_diff>